<commit_message>
Correction: rigs have Starlink; the rig tools are file-based by design, moving them is a rebuild not an impossibility (one-page, emails, notes, plan)
Co-Authored-By: Claude Fable 5.1 <noreply@anthropic.com>
Claude-Session: https://claude.ai/code/session_01HKpkuLyV6bHMBgkcjiDHio
</commit_message>
<xml_diff>
--- a/Email-Viren-SACRED-Lovable.docx
+++ b/Email-Viren-SACRED-Lovable.docx
@@ -173,7 +173,7 @@
           <w:sz w:val="22"/>
           <w:szCs w:val="22"/>
         </w:rPr>
-        <w:t xml:space="preserve"> are single self-contained HTML files that crews open on rig laptops, often offline, and that post one JSON file when finished. They cannot move to a hosted app and will stay as they are.</w:t>
+        <w:t xml:space="preserve"> are single self-contained HTML files that crews open on rig laptops, fill in over hours or days with local auto-save, and post as one JSON file when finished. Rigs have Starlink, so a hosted form is reachable in principle; but the tools are in service on fourteen rigs and the crews are trained, so moving them is a rebuild rather than a migration, and not one for February.</w:t>
       </w:r>
     </w:p>
     <w:p>
@@ -317,7 +317,7 @@
           <w:sz w:val="22"/>
           <w:szCs w:val="22"/>
         </w:rPr>
-        <w:t xml:space="preserve">So the honest framing is: a migration could remove the IIS server, the share, the scheduled task and the backup and DNS rows on ISIT's gap list. It would not remove the posting contract, the flows, the data model or the authenticated path for rig users, and it would add a build of the dashboard views on the platform, a second data store outside the tenancy, and the question of whether the platform is reachable from the rig networks.</w:t>
+        <w:t xml:space="preserve">So the honest framing is: a migration could remove the IIS server, the share, the scheduled task and the backup and DNS rows on ISIT's gap list. It would not remove the posting contract, the flows, the data model or the authenticated path for rig users, and it would add a build of the dashboard views on the platform, a second data store outside the tenancy, and the platform being provisioned for the rig networks the way the sacred server has to be.</w:t>
       </w:r>
     </w:p>
     <w:p>

</xml_diff>

<commit_message>
One-page: the migration pros-and-cons sections removed at Dan's ask; Viren email aligned
Co-Authored-By: Claude Fable 5.1 <noreply@anthropic.com>
Claude-Session: https://claude.ai/code/session_01HKpkuLyV6bHMBgkcjiDHio
</commit_message>
<xml_diff>
--- a/Email-Viren-SACRED-Lovable.docx
+++ b/Email-Viren-SACRED-Lovable.docx
@@ -141,7 +141,7 @@
           <w:sz w:val="22"/>
           <w:szCs w:val="22"/>
         </w:rPr>
-        <w:t xml:space="preserve">Following yesterday's meeting, you have the action to confirm whether SACRED could move to Lovable and what a high-level plan would look like. To make that quick to judge, the attached page sets out what SACRED is actually made of. It is five parts joined by files, so each can be looked at on its own.</w:t>
+        <w:t xml:space="preserve">Following yesterday's meeting, you have the action to confirm the feasibility of moving SACRED to Lovable and what a high-level plan would look like. To make that quick to judge, the attached page sets out what SACRED is actually made of. It is five parts joined by files, so each can be looked at on its own.</w:t>
       </w:r>
     </w:p>
     <w:p>
@@ -302,22 +302,6 @@
           <w:szCs w:val="22"/>
         </w:rPr>
         <w:t xml:space="preserve"> is a Copilot Studio agent reading the report digests in SharePoint. Unaffected by where the pages live.</w:t>
-      </w:r>
-    </w:p>
-    <w:p>
-      <w:pPr>
-        <w:spacing w:after="120" w:line="276"/>
-      </w:pPr>
-      <w:r>
-        <w:rPr>
-          <w:rFonts w:ascii="Calibri" w:cs="Calibri" w:eastAsia="Calibri" w:hAnsi="Calibri"/>
-          <w:b w:val="false"/>
-          <w:bCs w:val="false"/>
-          <w:color w:val="1B2733"/>
-          <w:sz w:val="22"/>
-          <w:szCs w:val="22"/>
-        </w:rPr>
-        <w:t xml:space="preserve">So the honest framing is: a migration could remove the IIS server, the share, the scheduled task and the backup and DNS rows on ISIT's gap list. It would not remove the posting contract, the flows, the data model or the authenticated path for rig users, and it would add a build of the dashboard views on the platform, a second data store outside the tenancy, and the platform being provisioned for the rig networks the way the sacred server has to be.</w:t>
       </w:r>
     </w:p>
     <w:p>

</xml_diff>